<commit_message>
docs: mise à jour (vente en gros, historique article, pages éditables, anti-cache)
- RECAP.md : modules (carton, champ fournisseur, historique, colonne Produits,
  bouton Créer un achat, pages éditables), modèle de données (nouvelles colonnes),
  endpoint /settings/public ; date 2026-07-28
- README.md : liste des modules enrichie
- generate-doc.mjs + DOCUMENTATION_PROJET.docx régénéré : mêmes ajouts

Co-Authored-By: Claude Opus 4.8 <noreply@anthropic.com>
</commit_message>
<xml_diff>
--- a/DOCUMENTATION_PROJET.docx
+++ b/DOCUMENTATION_PROJET.docx
@@ -1085,7 +1085,7 @@
         <w:spacing w:after="100"/>
       </w:pPr>
       <w:r>
-        <w:t xml:space="preserve">Le catalogue produits : création/modification, catégories &amp; sous-catégories, marques, entrepôts, unité de mesure, code-barres EAN-13 (génération + étiquette imprimable), colonne fournisseur, ajustement rapide de stock.</w:t>
+        <w:t xml:space="preserve">Le catalogue produits : création/modification, catégories &amp; sous-catégories, marques, entrepôts, champ fournisseur, unité de base, conditionnement « vente en gros » (1 carton = N pièces, prix carton), import d'image (limite 2 Mo), code-barres EAN-13 (génération + étiquette imprimable), fiche produit avec historique des mouvements, ajustement rapide de stock (avec bouton « Créer un achat » qui transforme une entrée en commande fournisseur réceptionnée).</w:t>
       </w:r>
     </w:p>
     <w:p>
@@ -1106,7 +1106,7 @@
         <w:spacing w:after="100"/>
       </w:pPr>
       <w:r>
-        <w:t xml:space="preserve">La vente au comptoir : panier, quantités, remise, moyens de paiement, livraison, paiement partiel/à crédit, TVA optionnelle, prix éditable par ligne (tarif client appliqué automatiquement, vente à perte bloquée), impression du reçu (ticket 80 mm ou facture A4).</w:t>
+        <w:t xml:space="preserve">La vente au comptoir : image produit mise en avant, panier, quantités, vente à la pièce ou au carton par ligne, remise, moyens de paiement, livraison, paiement partiel/à crédit, TVA optionnelle, prix éditable par ligne (tarif client appliqué automatiquement, vente à perte bloquée), impression du reçu (ticket 80 mm ou facture A4).</w:t>
       </w:r>
     </w:p>
     <w:p>
@@ -1190,7 +1190,7 @@
         <w:spacing w:after="100"/>
       </w:pPr>
       <w:r>
-        <w:t xml:space="preserve">Les commandes fournisseurs : création (produits pré-remplis selon le fournisseur), réception valorisée (met à jour le stock et le prix d'achat moyen), suivi des règlements (dette fournisseurs). TVA optionnelle, filtre par date.</w:t>
+        <w:t xml:space="preserve">Les commandes fournisseurs : création (produits pré-remplis selon le fournisseur), colonne « Produits » (nom + quantité), saisie à la pièce ou au carton, réception valorisée (met à jour le stock et le prix d'achat moyen), suivi des règlements (dette fournisseurs). TVA optionnelle, filtre par date.</w:t>
       </w:r>
     </w:p>
     <w:p>
@@ -1379,7 +1379,7 @@
         <w:spacing w:after="100"/>
       </w:pPr>
       <w:r>
-        <w:t xml:space="preserve">Les réglages : raison sociale, nom de marque, logo (initiales), NIF/Stat, devise et taux, thème, numérotation des factures/avoirs, et la matrice des permissions par rôle.</w:t>
+        <w:t xml:space="preserve">Les réglages : raison sociale, nom de marque, logo (initiales), NIF/Stat, devise et taux, thème, numérotation des factures/avoirs, la matrice des permissions par rôle, et les pages « À propos » / « Confidentialité » éditables (affichées sur le portail de connexion).</w:t>
       </w:r>
     </w:p>
     <w:p>
@@ -2256,6 +2256,26 @@
       </w:r>
       <w:r>
         <w:t xml:space="preserve"> : on peut définir un prix de vente spécifique par client et par produit (panneau « Tarifs »). En caisse, sélectionner le client applique automatiquement ses tarifs.</w:t>
+      </w:r>
+    </w:p>
+    <w:p>
+      <w:pPr>
+        <w:pStyle w:val="ListParagraph"/>
+        <w:numPr>
+          <w:ilvl w:val="0"/>
+          <w:numId w:val="1"/>
+        </w:numPr>
+        <w:spacing w:after="40"/>
+      </w:pPr>
+      <w:r>
+        <w:rPr>
+          <w:b/>
+          <w:bCs/>
+        </w:rPr>
+        <w:t xml:space="preserve">Vente en gros (carton)</w:t>
+      </w:r>
+      <w:r>
+        <w:t xml:space="preserve"> : un article peut définir un conditionnement (1 carton = N pièces) avec un prix carton. On achète et on vend à la pièce ou au carton ; le stock reste compté en pièces et se convertit automatiquement.</w:t>
       </w:r>
     </w:p>
     <w:p>

</xml_diff>